<commit_message>
Batch 7: Ma 20 + Joey 20 - cross-references added
</commit_message>
<xml_diff>
--- a/stories/docx/Joey 20.docx
+++ b/stories/docx/Joey 20.docx
@@ -124,6 +124,14 @@
       </w:pPr>
       <w:r>
         <w:t xml:space="preserve">I wish you were here, Frank. I wish you could see that I did it. That I held the line. That the store is still ours.</w:t>
+      </w:r>
+    </w:p>
+    <w:p>
+      <w:pPr>
+        <w:pStyle w:val="BodyText"/>
+      </w:pPr>
+      <w:r>
+        <w:t xml:space="preserve">I have not heard from you in a long time. I hope you are alive. I hope you are coming home.</w:t>
       </w:r>
     </w:p>
     <w:p>

</xml_diff>